<commit_message>
reparsing rules for tabulations, génération table langues ok pour BM2
Co-authored-by: Copilot <copilot@github.com>
</commit_message>
<xml_diff>
--- a/renders/DC_BM2_GLOBAL_generated.docx
+++ b/renders/DC_BM2_GLOBAL_generated.docx
@@ -89,13 +89,13 @@
     </w:p>
     <w:p>
       <w:pPr>
-        <w:pStyle w:val="DCHPoste"/>
+        <w:pStyle w:val="DCHDC"/>
       </w:pPr>
       <w:r>
         <w:rPr>
           <w:b/>
         </w:rPr>
-        <w:t>DOSSIER DE C OMPÉTENCES</w:t>
+        <w:t>DOSSIER DE COMPÉTENCES</w:t>
       </w:r>
     </w:p>
     <w:p>
@@ -343,6 +343,11 @@
         <w:pStyle w:val="DCNormal"/>
       </w:pPr>
     </w:p>
+    <w:p>
+      <w:pPr>
+        <w:pStyle w:val="DCNormal"/>
+      </w:pPr>
+    </w:p>
     <w:tbl>
       <w:tblPr>
         <w:tblW w:type="auto" w:w="0"/>
@@ -495,6 +500,11 @@
         <w:pStyle w:val="DCNormal"/>
       </w:pPr>
     </w:p>
+    <w:p>
+      <w:pPr>
+        <w:pStyle w:val="DCNormal"/>
+      </w:pPr>
+    </w:p>
     <w:tbl>
       <w:tblPr>
         <w:tblW w:type="auto" w:w="0"/>
@@ -613,32 +623,101 @@
     </w:p>
     <w:p>
       <w:pPr>
-        <w:pStyle w:val="DCT1Sections"/>
-      </w:pPr>
-      <w:r>
-        <w:t>Langues</w:t>
-      </w:r>
-    </w:p>
-    <w:p>
-      <w:pPr>
         <w:pStyle w:val="DCNormal"/>
       </w:pPr>
-      <w:r>
-        <w:t>Français</w:t>
-      </w:r>
-    </w:p>
+    </w:p>
+    <w:tbl>
+      <w:tblPr>
+        <w:tblW w:type="auto" w:w="0"/>
+        <w:tblLook w:firstColumn="1" w:firstRow="1" w:lastColumn="0" w:lastRow="0" w:noHBand="0" w:noVBand="1" w:val="04A0"/>
+        <w:tblBorders>
+          <w:top w:val="none" w:sz="0" w:space="0" w:color="auto"/>
+          <w:left w:val="none" w:sz="0" w:space="0" w:color="auto"/>
+          <w:bottom w:val="none" w:sz="0" w:space="0" w:color="auto"/>
+          <w:right w:val="none" w:sz="0" w:space="0" w:color="auto"/>
+          <w:insideH w:val="none" w:sz="0" w:space="0" w:color="auto"/>
+          <w:insideV w:val="none" w:sz="0" w:space="0" w:color="auto"/>
+        </w:tblBorders>
+      </w:tblPr>
+      <w:tblGrid>
+        <w:gridCol w:w="4819"/>
+        <w:gridCol w:w="4819"/>
+      </w:tblGrid>
+      <w:tr>
+        <w:trPr>
+          <w:trHeight w:val="360"/>
+        </w:trPr>
+        <w:tc>
+          <w:tcPr>
+            <w:tcW w:type="dxa" w:w="1701"/>
+            <w:vAlign w:val="center"/>
+          </w:tcPr>
+          <w:p>
+            <w:pPr>
+              <w:pStyle w:val="DCTableYear"/>
+              <w:jc w:val="left"/>
+            </w:pPr>
+            <w:r>
+              <w:t>Français</w:t>
+            </w:r>
+          </w:p>
+        </w:tc>
+        <w:tc>
+          <w:tcPr>
+            <w:tcW w:type="dxa" w:w="7937"/>
+            <w:vAlign w:val="center"/>
+          </w:tcPr>
+          <w:p>
+            <w:pPr>
+              <w:pStyle w:val="DCTableContent"/>
+              <w:jc w:val="left"/>
+            </w:pPr>
+            <w:r>
+              <w:t>Langue maternelle</w:t>
+            </w:r>
+          </w:p>
+        </w:tc>
+      </w:tr>
+      <w:tr>
+        <w:trPr>
+          <w:trHeight w:val="360"/>
+        </w:trPr>
+        <w:tc>
+          <w:tcPr>
+            <w:tcW w:type="dxa" w:w="1701"/>
+            <w:vAlign w:val="center"/>
+          </w:tcPr>
+          <w:p>
+            <w:pPr>
+              <w:pStyle w:val="DCTableYear"/>
+              <w:jc w:val="left"/>
+            </w:pPr>
+            <w:r>
+              <w:t>Anglais</w:t>
+            </w:r>
+          </w:p>
+        </w:tc>
+        <w:tc>
+          <w:tcPr>
+            <w:tcW w:type="dxa" w:w="7937"/>
+            <w:vAlign w:val="center"/>
+          </w:tcPr>
+          <w:p>
+            <w:pPr>
+              <w:pStyle w:val="DCTableContent"/>
+              <w:jc w:val="left"/>
+            </w:pPr>
+            <w:r>
+              <w:t>Niveau B1</w:t>
+            </w:r>
+          </w:p>
+        </w:tc>
+      </w:tr>
+    </w:tbl>
     <w:p>
       <w:pPr>
         <w:pStyle w:val="DCNormal"/>
-        <w:sectPr>
-          <w:type w:val="nextPage"/>
-          <w:pgSz w:w="11920" w:h="16840" w:orient="portrait"/>
-          <w:pgMar w:top="1440" w:right="1440" w:bottom="1440" w:left="1440" w:header="720" w:footer="720"/>
-        </w:sectPr>
-      </w:pPr>
-      <w:r>
-        <w:t>Anglais Niveau B1</w:t>
-      </w:r>
+      </w:pPr>
     </w:p>
     <w:p>
       <w:pPr>
@@ -1389,7 +1468,7 @@
         <w:pStyle w:val="DC1stbullet"/>
       </w:pPr>
       <w:r>
-        <w:t xml:space="preserve">  création d’une base de données de sons catégorisés</w:t>
+        <w:t xml:space="preserve"> création d’une base de données de sons catégorisés</w:t>
       </w:r>
     </w:p>
     <w:p>

</xml_diff>

<commit_message>
corrections largeurs de table education
Co-authored-by: Copilot <copilot@github.com>
</commit_message>
<xml_diff>
--- a/renders/DC_BM2_GLOBAL_generated.docx
+++ b/renders/DC_BM2_GLOBAL_generated.docx
@@ -343,15 +343,18 @@
         <w:pStyle w:val="DCNormal"/>
       </w:pPr>
     </w:p>
-    <w:p>
-      <w:pPr>
-        <w:pStyle w:val="DCNormal"/>
-      </w:pPr>
-    </w:p>
     <w:tbl>
       <w:tblPr>
         <w:tblW w:type="auto" w:w="0"/>
         <w:tblLook w:firstColumn="1" w:firstRow="1" w:lastColumn="0" w:lastRow="0" w:noHBand="0" w:noVBand="1" w:val="04A0"/>
+        <w:tblBorders>
+          <w:top w:val="none" w:sz="0" w:space="0" w:color="auto"/>
+          <w:left w:val="none" w:sz="0" w:space="0" w:color="auto"/>
+          <w:bottom w:val="none" w:sz="0" w:space="0" w:color="auto"/>
+          <w:right w:val="none" w:sz="0" w:space="0" w:color="auto"/>
+          <w:insideH w:val="none" w:sz="0" w:space="0" w:color="auto"/>
+          <w:insideV w:val="none" w:sz="0" w:space="0" w:color="auto"/>
+        </w:tblBorders>
       </w:tblPr>
       <w:tblGrid>
         <w:gridCol w:w="4819"/>
@@ -359,15 +362,17 @@
       </w:tblGrid>
       <w:tr>
         <w:trPr>
-          <w:trHeight w:val="390"/>
+          <w:trHeight w:val="360"/>
         </w:trPr>
         <w:tc>
           <w:tcPr>
-            <w:tcW w:type="dxa" w:w="976"/>
+            <w:tcW w:type="dxa" w:w="1701"/>
+            <w:vAlign w:val="center"/>
           </w:tcPr>
           <w:p>
             <w:pPr>
               <w:pStyle w:val="DCTableYear"/>
+              <w:jc w:val="left"/>
             </w:pPr>
             <w:r>
               <w:t>2006</w:t>
@@ -376,11 +381,13 @@
         </w:tc>
         <w:tc>
           <w:tcPr>
-            <w:tcW w:type="dxa" w:w="8662"/>
+            <w:tcW w:type="dxa" w:w="7937"/>
+            <w:vAlign w:val="center"/>
           </w:tcPr>
           <w:p>
             <w:pPr>
               <w:pStyle w:val="DCTableContent"/>
+              <w:jc w:val="left"/>
             </w:pPr>
             <w:r>
               <w:t>Doctorat Signal Image et Acoustique, option Acoustique, Université Paul Sabatier Toulouse</w:t>
@@ -390,15 +397,17 @@
       </w:tr>
       <w:tr>
         <w:trPr>
-          <w:trHeight w:val="390"/>
+          <w:trHeight w:val="360"/>
         </w:trPr>
         <w:tc>
           <w:tcPr>
-            <w:tcW w:type="dxa" w:w="976"/>
+            <w:tcW w:type="dxa" w:w="1701"/>
+            <w:vAlign w:val="center"/>
           </w:tcPr>
           <w:p>
             <w:pPr>
               <w:pStyle w:val="DCTableYear"/>
+              <w:jc w:val="left"/>
             </w:pPr>
             <w:r>
               <w:t>2002</w:t>
@@ -407,11 +416,13 @@
         </w:tc>
         <w:tc>
           <w:tcPr>
-            <w:tcW w:type="dxa" w:w="8662"/>
+            <w:tcW w:type="dxa" w:w="7937"/>
+            <w:vAlign w:val="center"/>
           </w:tcPr>
           <w:p>
             <w:pPr>
               <w:pStyle w:val="DCTableContent"/>
+              <w:jc w:val="left"/>
             </w:pPr>
             <w:r>
               <w:t>DEA Acoustique et Traitement du signal, Université Paul Sabatier Toulouse, ENSEEIHT</w:t>
@@ -421,15 +432,17 @@
       </w:tr>
       <w:tr>
         <w:trPr>
-          <w:trHeight w:val="390"/>
+          <w:trHeight w:val="360"/>
         </w:trPr>
         <w:tc>
           <w:tcPr>
-            <w:tcW w:type="dxa" w:w="976"/>
+            <w:tcW w:type="dxa" w:w="1701"/>
+            <w:vAlign w:val="center"/>
           </w:tcPr>
           <w:p>
             <w:pPr>
               <w:pStyle w:val="DCTableYear"/>
+              <w:jc w:val="left"/>
             </w:pPr>
             <w:r>
               <w:t>2002</w:t>
@@ -438,42 +451,31 @@
         </w:tc>
         <w:tc>
           <w:tcPr>
-            <w:tcW w:type="dxa" w:w="8662"/>
+            <w:tcW w:type="dxa" w:w="7937"/>
+            <w:vAlign w:val="center"/>
           </w:tcPr>
           <w:p>
             <w:pPr>
               <w:pStyle w:val="DCTableContent"/>
+              <w:jc w:val="left"/>
             </w:pPr>
             <w:r>
               <w:t>Maîtrise Physique et Applications,  Université de Lille</w:t>
             </w:r>
           </w:p>
-        </w:tc>
-      </w:tr>
-      <w:tr>
-        <w:trPr>
-          <w:trHeight w:val="390"/>
-        </w:trPr>
-        <w:tc>
-          <w:tcPr>
-            <w:tcW w:type="dxa" w:w="976"/>
-          </w:tcPr>
           <w:p>
             <w:pPr>
-              <w:pStyle w:val="DCTableYear"/>
+              <w:pStyle w:val="DCTableContent"/>
+              <w:jc w:val="left"/>
             </w:pPr>
             <w:r>
               <w:t>1996</w:t>
             </w:r>
           </w:p>
-        </w:tc>
-        <w:tc>
-          <w:tcPr>
-            <w:tcW w:type="dxa" w:w="8662"/>
-          </w:tcPr>
           <w:p>
             <w:pPr>
               <w:pStyle w:val="DCTableContent"/>
+              <w:jc w:val="left"/>
             </w:pPr>
             <w:r>
               <w:t>Baccalauréat S,  Albi</w:t>
@@ -500,15 +502,18 @@
         <w:pStyle w:val="DCNormal"/>
       </w:pPr>
     </w:p>
-    <w:p>
-      <w:pPr>
-        <w:pStyle w:val="DCNormal"/>
-      </w:pPr>
-    </w:p>
     <w:tbl>
       <w:tblPr>
         <w:tblW w:type="auto" w:w="0"/>
         <w:tblLook w:firstColumn="1" w:firstRow="1" w:lastColumn="0" w:lastRow="0" w:noHBand="0" w:noVBand="1" w:val="04A0"/>
+        <w:tblBorders>
+          <w:top w:val="none" w:sz="0" w:space="0" w:color="auto"/>
+          <w:left w:val="none" w:sz="0" w:space="0" w:color="auto"/>
+          <w:bottom w:val="none" w:sz="0" w:space="0" w:color="auto"/>
+          <w:right w:val="none" w:sz="0" w:space="0" w:color="auto"/>
+          <w:insideH w:val="none" w:sz="0" w:space="0" w:color="auto"/>
+          <w:insideV w:val="none" w:sz="0" w:space="0" w:color="auto"/>
+        </w:tblBorders>
       </w:tblPr>
       <w:tblGrid>
         <w:gridCol w:w="4819"/>
@@ -516,15 +521,17 @@
       </w:tblGrid>
       <w:tr>
         <w:trPr>
-          <w:trHeight w:val="390"/>
+          <w:trHeight w:val="360"/>
         </w:trPr>
         <w:tc>
           <w:tcPr>
-            <w:tcW w:type="dxa" w:w="1008"/>
+            <w:tcW w:type="dxa" w:w="1701"/>
+            <w:vAlign w:val="center"/>
           </w:tcPr>
           <w:p>
             <w:pPr>
               <w:pStyle w:val="DCTableYear"/>
+              <w:jc w:val="left"/>
             </w:pPr>
             <w:r>
               <w:t>2022</w:t>
@@ -533,11 +540,13 @@
         </w:tc>
         <w:tc>
           <w:tcPr>
-            <w:tcW w:type="dxa" w:w="9049"/>
+            <w:tcW w:type="dxa" w:w="7937"/>
+            <w:vAlign w:val="center"/>
           </w:tcPr>
           <w:p>
             <w:pPr>
               <w:pStyle w:val="DCTableContent"/>
+              <w:jc w:val="left"/>
             </w:pPr>
             <w:r>
               <w:t>C++ Certified Professional Programmer (CPP) - C++ Institute</w:t>
@@ -547,15 +556,17 @@
       </w:tr>
       <w:tr>
         <w:trPr>
-          <w:trHeight w:val="390"/>
+          <w:trHeight w:val="360"/>
         </w:trPr>
         <w:tc>
           <w:tcPr>
-            <w:tcW w:type="dxa" w:w="1008"/>
+            <w:tcW w:type="dxa" w:w="1701"/>
+            <w:vAlign w:val="center"/>
           </w:tcPr>
           <w:p>
             <w:pPr>
               <w:pStyle w:val="DCTableYear"/>
+              <w:jc w:val="left"/>
             </w:pPr>
             <w:r>
               <w:t>2022</w:t>
@@ -564,11 +575,13 @@
         </w:tc>
         <w:tc>
           <w:tcPr>
-            <w:tcW w:type="dxa" w:w="9049"/>
+            <w:tcW w:type="dxa" w:w="7937"/>
+            <w:vAlign w:val="center"/>
           </w:tcPr>
           <w:p>
             <w:pPr>
               <w:pStyle w:val="DCTableContent"/>
+              <w:jc w:val="left"/>
             </w:pPr>
             <w:r>
               <w:t>C++ Certified Associate Programmer (CPA) - C++ Institute</w:t>
@@ -578,15 +591,17 @@
       </w:tr>
       <w:tr>
         <w:trPr>
-          <w:trHeight w:val="390"/>
+          <w:trHeight w:val="360"/>
         </w:trPr>
         <w:tc>
           <w:tcPr>
-            <w:tcW w:type="dxa" w:w="1008"/>
+            <w:tcW w:type="dxa" w:w="1701"/>
+            <w:vAlign w:val="center"/>
           </w:tcPr>
           <w:p>
             <w:pPr>
               <w:pStyle w:val="DCTableYear"/>
+              <w:jc w:val="left"/>
             </w:pPr>
             <w:r>
               <w:t>2017</w:t>
@@ -595,11 +610,13 @@
         </w:tc>
         <w:tc>
           <w:tcPr>
-            <w:tcW w:type="dxa" w:w="9049"/>
+            <w:tcW w:type="dxa" w:w="7937"/>
+            <w:vAlign w:val="center"/>
           </w:tcPr>
           <w:p>
             <w:pPr>
               <w:pStyle w:val="DCTableContent"/>
+              <w:jc w:val="left"/>
             </w:pPr>
             <w:r>
               <w:t>Acoustique des instruments de musique, psychoacoustique, codage numérique - CNAM</w:t>

</xml_diff>

<commit_message>
gestion de table main_skills ok, largeurs ok
Co-authored-by: Copilot <copilot@github.com>
</commit_message>
<xml_diff>
--- a/renders/DC_BM2_GLOBAL_generated.docx
+++ b/renders/DC_BM2_GLOBAL_generated.docx
@@ -178,174 +178,7 @@
     <w:tbl>
       <w:tblPr>
         <w:tblW w:type="auto" w:w="0"/>
-        <w:tblLook w:firstColumn="1" w:firstRow="1" w:lastColumn="0" w:lastRow="0" w:noHBand="0" w:noVBand="1" w:val="04A0"/>
-      </w:tblPr>
-      <w:tblGrid>
-        <w:gridCol w:w="4819"/>
-        <w:gridCol w:w="4819"/>
-      </w:tblGrid>
-      <w:tr>
-        <w:trPr>
-          <w:trHeight w:val="454"/>
-        </w:trPr>
-        <w:tc>
-          <w:tcPr>
-            <w:tcW w:type="dxa" w:w="4185"/>
-          </w:tcPr>
-          <w:p>
-            <w:r>
-              <w:rPr>
-                <w:b/>
-              </w:rPr>
-              <w:t>LANGAGES</w:t>
-            </w:r>
-          </w:p>
-        </w:tc>
-        <w:tc>
-          <w:tcPr>
-            <w:tcW w:type="dxa" w:w="5453"/>
-          </w:tcPr>
-          <w:p>
-            <w:r>
-              <w:t>C++, Python, Matlab</w:t>
-            </w:r>
-          </w:p>
-        </w:tc>
-      </w:tr>
-      <w:tr>
-        <w:trPr>
-          <w:trHeight w:val="454"/>
-        </w:trPr>
-        <w:tc>
-          <w:tcPr>
-            <w:tcW w:type="dxa" w:w="4185"/>
-          </w:tcPr>
-          <w:p>
-            <w:r>
-              <w:rPr>
-                <w:b/>
-              </w:rPr>
-              <w:t>IDE</w:t>
-            </w:r>
-          </w:p>
-        </w:tc>
-        <w:tc>
-          <w:tcPr>
-            <w:tcW w:type="dxa" w:w="5453"/>
-          </w:tcPr>
-          <w:p>
-            <w:r>
-              <w:t>Visual studio</w:t>
-            </w:r>
-          </w:p>
-        </w:tc>
-      </w:tr>
-      <w:tr>
-        <w:trPr>
-          <w:trHeight w:val="454"/>
-        </w:trPr>
-        <w:tc>
-          <w:tcPr>
-            <w:tcW w:type="dxa" w:w="4185"/>
-          </w:tcPr>
-          <w:p>
-            <w:r>
-              <w:rPr>
-                <w:b/>
-              </w:rPr>
-              <w:t>GESTION DE VERSION</w:t>
-            </w:r>
-          </w:p>
-        </w:tc>
-        <w:tc>
-          <w:tcPr>
-            <w:tcW w:type="dxa" w:w="5453"/>
-          </w:tcPr>
-          <w:p>
-            <w:r>
-              <w:t>Git, SVN</w:t>
-            </w:r>
-          </w:p>
-        </w:tc>
-      </w:tr>
-      <w:tr>
-        <w:trPr>
-          <w:trHeight w:val="454"/>
-        </w:trPr>
-        <w:tc>
-          <w:tcPr>
-            <w:tcW w:type="dxa" w:w="4185"/>
-          </w:tcPr>
-          <w:p>
-            <w:r>
-              <w:rPr>
-                <w:b/>
-              </w:rPr>
-              <w:t>ENVIRONNEMENTS</w:t>
-            </w:r>
-          </w:p>
-        </w:tc>
-        <w:tc>
-          <w:tcPr>
-            <w:tcW w:type="dxa" w:w="5453"/>
-          </w:tcPr>
-          <w:p>
-            <w:r>
-              <w:t>Windows, Linux</w:t>
-            </w:r>
-          </w:p>
-        </w:tc>
-      </w:tr>
-      <w:tr>
-        <w:trPr>
-          <w:trHeight w:val="454"/>
-        </w:trPr>
-        <w:tc>
-          <w:tcPr>
-            <w:tcW w:type="dxa" w:w="4185"/>
-          </w:tcPr>
-          <w:p>
-            <w:r>
-              <w:rPr>
-                <w:b/>
-              </w:rPr>
-              <w:t>FRAMEWORKS</w:t>
-            </w:r>
-          </w:p>
-        </w:tc>
-        <w:tc>
-          <w:tcPr>
-            <w:tcW w:type="dxa" w:w="5453"/>
-          </w:tcPr>
-          <w:p>
-            <w:r>
-              <w:t>Juce, Qt</w:t>
-            </w:r>
-          </w:p>
-        </w:tc>
-      </w:tr>
-    </w:tbl>
-    <w:p>
-      <w:pPr>
-        <w:pStyle w:val="DCNormal"/>
-      </w:pPr>
-    </w:p>
-    <w:p>
-      <w:pPr>
-        <w:pStyle w:val="DCT1Sections"/>
-      </w:pPr>
-      <w:r>
-        <w:t>Diplômes</w:t>
-      </w:r>
-    </w:p>
-    <w:p>
-      <w:pPr>
-        <w:pStyle w:val="DCNormal"/>
-      </w:pPr>
-    </w:p>
-    <w:tbl>
-      <w:tblPr>
-        <w:tblW w:type="auto" w:w="0"/>
+        <w:tblLayout w:type="fixed"/>
         <w:tblLook w:firstColumn="1" w:firstRow="1" w:lastColumn="0" w:lastRow="0" w:noHBand="0" w:noVBand="1" w:val="04A0"/>
         <w:tblBorders>
           <w:top w:val="none" w:sz="0" w:space="0" w:color="auto"/>
@@ -359,6 +192,233 @@
       <w:tblGrid>
         <w:gridCol w:w="4819"/>
         <w:gridCol w:w="4819"/>
+      </w:tblGrid>
+      <w:tr>
+        <w:trPr>
+          <w:trHeight w:val="360"/>
+        </w:trPr>
+        <w:tc>
+          <w:tcPr>
+            <w:tcW w:type="dxa" w:w="4819"/>
+            <w:vAlign w:val="center"/>
+          </w:tcPr>
+          <w:p>
+            <w:pPr>
+              <w:pStyle w:val="DCTableSkillsTitle"/>
+              <w:jc w:val="center"/>
+            </w:pPr>
+            <w:r>
+              <w:rPr>
+                <w:b/>
+              </w:rPr>
+              <w:t>LANGAGES</w:t>
+            </w:r>
+          </w:p>
+        </w:tc>
+        <w:tc>
+          <w:tcPr>
+            <w:tcW w:type="dxa" w:w="4819"/>
+            <w:vAlign w:val="center"/>
+          </w:tcPr>
+          <w:p>
+            <w:pPr>
+              <w:pStyle w:val="DCTableSkillsContent"/>
+              <w:jc w:val="left"/>
+            </w:pPr>
+            <w:r>
+              <w:t>C++, Python, Matlab</w:t>
+            </w:r>
+          </w:p>
+        </w:tc>
+      </w:tr>
+      <w:tr>
+        <w:trPr>
+          <w:trHeight w:val="360"/>
+        </w:trPr>
+        <w:tc>
+          <w:tcPr>
+            <w:tcW w:type="dxa" w:w="4819"/>
+            <w:vAlign w:val="center"/>
+          </w:tcPr>
+          <w:p>
+            <w:pPr>
+              <w:pStyle w:val="DCTableSkillsTitle"/>
+              <w:jc w:val="center"/>
+            </w:pPr>
+            <w:r>
+              <w:rPr>
+                <w:b/>
+              </w:rPr>
+              <w:t>IDE</w:t>
+            </w:r>
+          </w:p>
+        </w:tc>
+        <w:tc>
+          <w:tcPr>
+            <w:tcW w:type="dxa" w:w="4819"/>
+            <w:vAlign w:val="center"/>
+          </w:tcPr>
+          <w:p>
+            <w:pPr>
+              <w:pStyle w:val="DCTableSkillsContent"/>
+              <w:jc w:val="left"/>
+            </w:pPr>
+            <w:r>
+              <w:t>Visual studio</w:t>
+            </w:r>
+          </w:p>
+        </w:tc>
+      </w:tr>
+      <w:tr>
+        <w:trPr>
+          <w:trHeight w:val="360"/>
+        </w:trPr>
+        <w:tc>
+          <w:tcPr>
+            <w:tcW w:type="dxa" w:w="4819"/>
+            <w:vAlign w:val="center"/>
+          </w:tcPr>
+          <w:p>
+            <w:pPr>
+              <w:pStyle w:val="DCTableSkillsTitle"/>
+              <w:jc w:val="center"/>
+            </w:pPr>
+            <w:r>
+              <w:rPr>
+                <w:b/>
+              </w:rPr>
+              <w:t>GESTION DE VERSION</w:t>
+            </w:r>
+          </w:p>
+        </w:tc>
+        <w:tc>
+          <w:tcPr>
+            <w:tcW w:type="dxa" w:w="4819"/>
+            <w:vAlign w:val="center"/>
+          </w:tcPr>
+          <w:p>
+            <w:pPr>
+              <w:pStyle w:val="DCTableSkillsContent"/>
+              <w:jc w:val="left"/>
+            </w:pPr>
+            <w:r>
+              <w:t>Git, SVN</w:t>
+            </w:r>
+          </w:p>
+        </w:tc>
+      </w:tr>
+      <w:tr>
+        <w:trPr>
+          <w:trHeight w:val="360"/>
+        </w:trPr>
+        <w:tc>
+          <w:tcPr>
+            <w:tcW w:type="dxa" w:w="4819"/>
+            <w:vAlign w:val="center"/>
+          </w:tcPr>
+          <w:p>
+            <w:pPr>
+              <w:pStyle w:val="DCTableSkillsTitle"/>
+              <w:jc w:val="center"/>
+            </w:pPr>
+            <w:r>
+              <w:rPr>
+                <w:b/>
+              </w:rPr>
+              <w:t>ENVIRONNEMENTS</w:t>
+            </w:r>
+          </w:p>
+        </w:tc>
+        <w:tc>
+          <w:tcPr>
+            <w:tcW w:type="dxa" w:w="4819"/>
+            <w:vAlign w:val="center"/>
+          </w:tcPr>
+          <w:p>
+            <w:pPr>
+              <w:pStyle w:val="DCTableSkillsContent"/>
+              <w:jc w:val="left"/>
+            </w:pPr>
+            <w:r>
+              <w:t>Windows, Linux</w:t>
+            </w:r>
+          </w:p>
+        </w:tc>
+      </w:tr>
+      <w:tr>
+        <w:trPr>
+          <w:trHeight w:val="360"/>
+        </w:trPr>
+        <w:tc>
+          <w:tcPr>
+            <w:tcW w:type="dxa" w:w="4819"/>
+            <w:vAlign w:val="center"/>
+          </w:tcPr>
+          <w:p>
+            <w:pPr>
+              <w:pStyle w:val="DCTableSkillsTitle"/>
+              <w:jc w:val="center"/>
+            </w:pPr>
+            <w:r>
+              <w:rPr>
+                <w:b/>
+              </w:rPr>
+              <w:t>FRAMEWORKS</w:t>
+            </w:r>
+          </w:p>
+        </w:tc>
+        <w:tc>
+          <w:tcPr>
+            <w:tcW w:type="dxa" w:w="4819"/>
+            <w:vAlign w:val="center"/>
+          </w:tcPr>
+          <w:p>
+            <w:pPr>
+              <w:pStyle w:val="DCTableSkillsContent"/>
+              <w:jc w:val="left"/>
+            </w:pPr>
+            <w:r>
+              <w:t>Juce, Qt</w:t>
+            </w:r>
+          </w:p>
+        </w:tc>
+      </w:tr>
+    </w:tbl>
+    <w:p>
+      <w:pPr>
+        <w:pStyle w:val="DCNormal"/>
+      </w:pPr>
+    </w:p>
+    <w:p>
+      <w:pPr>
+        <w:pStyle w:val="DCT1Sections"/>
+      </w:pPr>
+      <w:r>
+        <w:t>Diplômes</w:t>
+      </w:r>
+    </w:p>
+    <w:p>
+      <w:pPr>
+        <w:pStyle w:val="DCNormal"/>
+      </w:pPr>
+    </w:p>
+    <w:tbl>
+      <w:tblPr>
+        <w:tblW w:type="auto" w:w="0"/>
+        <w:tblLayout w:type="fixed"/>
+        <w:tblLook w:firstColumn="1" w:firstRow="1" w:lastColumn="0" w:lastRow="0" w:noHBand="0" w:noVBand="1" w:val="04A0"/>
+        <w:tblBorders>
+          <w:top w:val="none" w:sz="0" w:space="0" w:color="auto"/>
+          <w:left w:val="none" w:sz="0" w:space="0" w:color="auto"/>
+          <w:bottom w:val="none" w:sz="0" w:space="0" w:color="auto"/>
+          <w:right w:val="none" w:sz="0" w:space="0" w:color="auto"/>
+          <w:insideH w:val="none" w:sz="0" w:space="0" w:color="auto"/>
+          <w:insideV w:val="none" w:sz="0" w:space="0" w:color="auto"/>
+        </w:tblBorders>
+      </w:tblPr>
+      <w:tblGrid>
+        <w:gridCol w:w="1701"/>
+        <w:gridCol w:w="7937"/>
       </w:tblGrid>
       <w:tr>
         <w:trPr>
@@ -505,6 +565,7 @@
     <w:tbl>
       <w:tblPr>
         <w:tblW w:type="auto" w:w="0"/>
+        <w:tblLayout w:type="fixed"/>
         <w:tblLook w:firstColumn="1" w:firstRow="1" w:lastColumn="0" w:lastRow="0" w:noHBand="0" w:noVBand="1" w:val="04A0"/>
         <w:tblBorders>
           <w:top w:val="none" w:sz="0" w:space="0" w:color="auto"/>
@@ -516,8 +577,8 @@
         </w:tblBorders>
       </w:tblPr>
       <w:tblGrid>
-        <w:gridCol w:w="4819"/>
-        <w:gridCol w:w="4819"/>
+        <w:gridCol w:w="1701"/>
+        <w:gridCol w:w="7937"/>
       </w:tblGrid>
       <w:tr>
         <w:trPr>
@@ -646,6 +707,7 @@
     <w:tbl>
       <w:tblPr>
         <w:tblW w:type="auto" w:w="0"/>
+        <w:tblLayout w:type="fixed"/>
         <w:tblLook w:firstColumn="1" w:firstRow="1" w:lastColumn="0" w:lastRow="0" w:noHBand="0" w:noVBand="1" w:val="04A0"/>
         <w:tblBorders>
           <w:top w:val="none" w:sz="0" w:space="0" w:color="auto"/>
@@ -657,8 +719,8 @@
         </w:tblBorders>
       </w:tblPr>
       <w:tblGrid>
-        <w:gridCol w:w="4819"/>
-        <w:gridCol w:w="4819"/>
+        <w:gridCol w:w="1701"/>
+        <w:gridCol w:w="7937"/>
       </w:tblGrid>
       <w:tr>
         <w:trPr>
@@ -752,6 +814,7 @@
     <w:tbl>
       <w:tblPr>
         <w:tblW w:type="auto" w:w="0"/>
+        <w:tblLayout w:type="fixed"/>
         <w:tblLook w:firstColumn="1" w:firstRow="1" w:lastColumn="0" w:lastRow="0" w:noHBand="0" w:noVBand="1" w:val="04A0"/>
         <w:tblBorders>
           <w:top w:val="none" w:sz="0" w:space="0" w:color="auto"/>
@@ -763,8 +826,8 @@
         </w:tblBorders>
       </w:tblPr>
       <w:tblGrid>
-        <w:gridCol w:w="4819"/>
-        <w:gridCol w:w="4819"/>
+        <w:gridCol w:w="6803"/>
+        <w:gridCol w:w="2835"/>
       </w:tblGrid>
       <w:tr>
         <w:trPr>
@@ -1007,6 +1070,7 @@
     <w:tbl>
       <w:tblPr>
         <w:tblW w:type="auto" w:w="0"/>
+        <w:tblLayout w:type="fixed"/>
         <w:tblLook w:firstColumn="1" w:firstRow="1" w:lastColumn="0" w:lastRow="0" w:noHBand="0" w:noVBand="1" w:val="04A0"/>
         <w:tblBorders>
           <w:top w:val="none" w:sz="0" w:space="0" w:color="auto"/>
@@ -1018,8 +1082,8 @@
         </w:tblBorders>
       </w:tblPr>
       <w:tblGrid>
-        <w:gridCol w:w="4819"/>
-        <w:gridCol w:w="4819"/>
+        <w:gridCol w:w="6803"/>
+        <w:gridCol w:w="2835"/>
       </w:tblGrid>
       <w:tr>
         <w:trPr>
@@ -1231,6 +1295,7 @@
     <w:tbl>
       <w:tblPr>
         <w:tblW w:type="auto" w:w="0"/>
+        <w:tblLayout w:type="fixed"/>
         <w:tblLook w:firstColumn="1" w:firstRow="1" w:lastColumn="0" w:lastRow="0" w:noHBand="0" w:noVBand="1" w:val="04A0"/>
         <w:tblBorders>
           <w:top w:val="none" w:sz="0" w:space="0" w:color="auto"/>
@@ -1242,8 +1307,8 @@
         </w:tblBorders>
       </w:tblPr>
       <w:tblGrid>
-        <w:gridCol w:w="4819"/>
-        <w:gridCol w:w="4819"/>
+        <w:gridCol w:w="6803"/>
+        <w:gridCol w:w="2835"/>
       </w:tblGrid>
       <w:tr>
         <w:trPr>
@@ -1515,6 +1580,7 @@
     <w:tbl>
       <w:tblPr>
         <w:tblW w:type="auto" w:w="0"/>
+        <w:tblLayout w:type="fixed"/>
         <w:tblLook w:firstColumn="1" w:firstRow="1" w:lastColumn="0" w:lastRow="0" w:noHBand="0" w:noVBand="1" w:val="04A0"/>
         <w:tblBorders>
           <w:top w:val="none" w:sz="0" w:space="0" w:color="auto"/>
@@ -1526,8 +1592,8 @@
         </w:tblBorders>
       </w:tblPr>
       <w:tblGrid>
-        <w:gridCol w:w="4819"/>
-        <w:gridCol w:w="4819"/>
+        <w:gridCol w:w="6803"/>
+        <w:gridCol w:w="2835"/>
       </w:tblGrid>
       <w:tr>
         <w:trPr>
@@ -1700,6 +1766,7 @@
     <w:tbl>
       <w:tblPr>
         <w:tblW w:type="auto" w:w="0"/>
+        <w:tblLayout w:type="fixed"/>
         <w:tblLook w:firstColumn="1" w:firstRow="1" w:lastColumn="0" w:lastRow="0" w:noHBand="0" w:noVBand="1" w:val="04A0"/>
         <w:tblBorders>
           <w:top w:val="none" w:sz="0" w:space="0" w:color="auto"/>
@@ -1711,8 +1778,8 @@
         </w:tblBorders>
       </w:tblPr>
       <w:tblGrid>
-        <w:gridCol w:w="4819"/>
-        <w:gridCol w:w="4819"/>
+        <w:gridCol w:w="6803"/>
+        <w:gridCol w:w="2835"/>
       </w:tblGrid>
       <w:tr>
         <w:trPr>
@@ -1880,6 +1947,7 @@
     <w:tbl>
       <w:tblPr>
         <w:tblW w:type="auto" w:w="0"/>
+        <w:tblLayout w:type="fixed"/>
         <w:tblLook w:firstColumn="1" w:firstRow="1" w:lastColumn="0" w:lastRow="0" w:noHBand="0" w:noVBand="1" w:val="04A0"/>
         <w:tblBorders>
           <w:top w:val="none" w:sz="0" w:space="0" w:color="auto"/>
@@ -1891,8 +1959,8 @@
         </w:tblBorders>
       </w:tblPr>
       <w:tblGrid>
-        <w:gridCol w:w="4819"/>
-        <w:gridCol w:w="4819"/>
+        <w:gridCol w:w="6803"/>
+        <w:gridCol w:w="2835"/>
       </w:tblGrid>
       <w:tr>
         <w:trPr>
@@ -2036,6 +2104,7 @@
     <w:tbl>
       <w:tblPr>
         <w:tblW w:type="auto" w:w="0"/>
+        <w:tblLayout w:type="fixed"/>
         <w:tblLook w:firstColumn="1" w:firstRow="1" w:lastColumn="0" w:lastRow="0" w:noHBand="0" w:noVBand="1" w:val="04A0"/>
         <w:tblBorders>
           <w:top w:val="none" w:sz="0" w:space="0" w:color="auto"/>
@@ -2047,8 +2116,8 @@
         </w:tblBorders>
       </w:tblPr>
       <w:tblGrid>
-        <w:gridCol w:w="4819"/>
-        <w:gridCol w:w="4819"/>
+        <w:gridCol w:w="6803"/>
+        <w:gridCol w:w="2835"/>
       </w:tblGrid>
       <w:tr>
         <w:trPr>
@@ -2272,6 +2341,7 @@
     <w:tbl>
       <w:tblPr>
         <w:tblW w:type="auto" w:w="0"/>
+        <w:tblLayout w:type="fixed"/>
         <w:tblLook w:firstColumn="1" w:firstRow="1" w:lastColumn="0" w:lastRow="0" w:noHBand="0" w:noVBand="1" w:val="04A0"/>
         <w:tblBorders>
           <w:top w:val="none" w:sz="0" w:space="0" w:color="auto"/>
@@ -2283,8 +2353,8 @@
         </w:tblBorders>
       </w:tblPr>
       <w:tblGrid>
-        <w:gridCol w:w="4819"/>
-        <w:gridCol w:w="4819"/>
+        <w:gridCol w:w="6803"/>
+        <w:gridCol w:w="2835"/>
       </w:tblGrid>
       <w:tr>
         <w:trPr>
@@ -2487,6 +2557,7 @@
     <w:tbl>
       <w:tblPr>
         <w:tblW w:type="auto" w:w="0"/>
+        <w:tblLayout w:type="fixed"/>
         <w:tblLook w:firstColumn="1" w:firstRow="1" w:lastColumn="0" w:lastRow="0" w:noHBand="0" w:noVBand="1" w:val="04A0"/>
         <w:tblBorders>
           <w:top w:val="none" w:sz="0" w:space="0" w:color="auto"/>
@@ -2498,8 +2569,8 @@
         </w:tblBorders>
       </w:tblPr>
       <w:tblGrid>
-        <w:gridCol w:w="4819"/>
-        <w:gridCol w:w="4819"/>
+        <w:gridCol w:w="6803"/>
+        <w:gridCol w:w="2835"/>
       </w:tblGrid>
       <w:tr>
         <w:trPr>

</xml_diff>